<commit_message>
adding gui; login features
</commit_message>
<xml_diff>
--- a/Docs/Vehicle Routing Problem.docx
+++ b/Docs/Vehicle Routing Problem.docx
@@ -6,6 +6,285 @@
       <w:pPr>
         <w:rPr>
           <w:rFonts w:ascii="Segoe UI Emoji" w:hAnsi="Segoe UI Emoji" w:cs="Segoe UI Emoji"/>
+        </w:rPr>
+      </w:pPr>
+      <w:r>
+        <w:rPr>
+          <w:rFonts w:ascii="Segoe UI Emoji" w:hAnsi="Segoe UI Emoji" w:cs="Segoe UI Emoji"/>
+        </w:rPr>
+        <w:t>Re-</w:t>
+      </w:r>
+      <w:proofErr w:type="spellStart"/>
+      <w:proofErr w:type="gramStart"/>
+      <w:r>
+        <w:rPr>
+          <w:rFonts w:ascii="Segoe UI Emoji" w:hAnsi="Segoe UI Emoji" w:cs="Segoe UI Emoji"/>
+        </w:rPr>
+        <w:t>init</w:t>
+      </w:r>
+      <w:proofErr w:type="spellEnd"/>
+      <w:r>
+        <w:rPr>
+          <w:rFonts w:ascii="Segoe UI Emoji" w:hAnsi="Segoe UI Emoji" w:cs="Segoe UI Emoji"/>
+        </w:rPr>
+        <w:t xml:space="preserve">  after</w:t>
+      </w:r>
+      <w:proofErr w:type="gramEnd"/>
+      <w:r>
+        <w:rPr>
+          <w:rFonts w:ascii="Segoe UI Emoji" w:hAnsi="Segoe UI Emoji" w:cs="Segoe UI Emoji"/>
+        </w:rPr>
+        <w:t xml:space="preserve"> </w:t>
+      </w:r>
+      <w:proofErr w:type="gramStart"/>
+      <w:r>
+        <w:rPr>
+          <w:rFonts w:ascii="Segoe UI Emoji" w:hAnsi="Segoe UI Emoji" w:cs="Segoe UI Emoji"/>
+        </w:rPr>
+        <w:t>clone :</w:t>
+      </w:r>
+      <w:proofErr w:type="gramEnd"/>
+      <w:r>
+        <w:rPr>
+          <w:rFonts w:ascii="Segoe UI Emoji" w:hAnsi="Segoe UI Emoji" w:cs="Segoe UI Emoji"/>
+        </w:rPr>
+        <w:br/>
+      </w:r>
+      <w:r>
+        <w:rPr>
+          <w:rFonts w:ascii="Segoe UI Emoji" w:hAnsi="Segoe UI Emoji" w:cs="Segoe UI Emoji"/>
+        </w:rPr>
+        <w:tab/>
+        <w:t># 1. Install</w:t>
+      </w:r>
+    </w:p>
+    <w:p>
+      <w:pPr>
+        <w:ind w:left="720"/>
+        <w:rPr>
+          <w:rFonts w:ascii="Segoe UI Emoji" w:hAnsi="Segoe UI Emoji" w:cs="Segoe UI Emoji"/>
+        </w:rPr>
+      </w:pPr>
+      <w:proofErr w:type="spellStart"/>
+      <w:r>
+        <w:rPr>
+          <w:rFonts w:ascii="Segoe UI Emoji" w:hAnsi="Segoe UI Emoji" w:cs="Segoe UI Emoji"/>
+        </w:rPr>
+        <w:t>npm</w:t>
+      </w:r>
+      <w:proofErr w:type="spellEnd"/>
+      <w:r>
+        <w:rPr>
+          <w:rFonts w:ascii="Segoe UI Emoji" w:hAnsi="Segoe UI Emoji" w:cs="Segoe UI Emoji"/>
+        </w:rPr>
+        <w:t xml:space="preserve"> install</w:t>
+      </w:r>
+    </w:p>
+    <w:p>
+      <w:pPr>
+        <w:ind w:left="720"/>
+        <w:rPr>
+          <w:rFonts w:ascii="Segoe UI Emoji" w:hAnsi="Segoe UI Emoji" w:cs="Segoe UI Emoji"/>
+        </w:rPr>
+      </w:pPr>
+    </w:p>
+    <w:p>
+      <w:pPr>
+        <w:ind w:left="720"/>
+        <w:rPr>
+          <w:rFonts w:ascii="Segoe UI Emoji" w:hAnsi="Segoe UI Emoji" w:cs="Segoe UI Emoji"/>
+        </w:rPr>
+      </w:pPr>
+      <w:r>
+        <w:rPr>
+          <w:rFonts w:ascii="Segoe UI Emoji" w:hAnsi="Segoe UI Emoji" w:cs="Segoe UI Emoji"/>
+        </w:rPr>
+        <w:t xml:space="preserve"># 2. </w:t>
+      </w:r>
+      <w:proofErr w:type="gramStart"/>
+      <w:r>
+        <w:rPr>
+          <w:rFonts w:ascii="Segoe UI Emoji" w:hAnsi="Segoe UI Emoji" w:cs="Segoe UI Emoji"/>
+        </w:rPr>
+        <w:t>Setup .env</w:t>
+      </w:r>
+      <w:proofErr w:type="gramEnd"/>
+      <w:r>
+        <w:rPr>
+          <w:rFonts w:ascii="Segoe UI Emoji" w:hAnsi="Segoe UI Emoji" w:cs="Segoe UI Emoji"/>
+        </w:rPr>
+        <w:t xml:space="preserve"> MANUAL DULU (JANGAN LUPA!)</w:t>
+      </w:r>
+    </w:p>
+    <w:p>
+      <w:pPr>
+        <w:ind w:left="720"/>
+        <w:rPr>
+          <w:rFonts w:ascii="Segoe UI Emoji" w:hAnsi="Segoe UI Emoji" w:cs="Segoe UI Emoji"/>
+        </w:rPr>
+      </w:pPr>
+    </w:p>
+    <w:p>
+      <w:pPr>
+        <w:ind w:left="720"/>
+        <w:rPr>
+          <w:rFonts w:ascii="Segoe UI Emoji" w:hAnsi="Segoe UI Emoji" w:cs="Segoe UI Emoji"/>
+        </w:rPr>
+      </w:pPr>
+      <w:r>
+        <w:rPr>
+          <w:rFonts w:ascii="Segoe UI Emoji" w:hAnsi="Segoe UI Emoji" w:cs="Segoe UI Emoji"/>
+        </w:rPr>
+        <w:t># 3. Setup Database</w:t>
+      </w:r>
+    </w:p>
+    <w:p>
+      <w:pPr>
+        <w:ind w:left="720"/>
+        <w:rPr>
+          <w:rFonts w:ascii="Segoe UI Emoji" w:hAnsi="Segoe UI Emoji" w:cs="Segoe UI Emoji"/>
+        </w:rPr>
+      </w:pPr>
+      <w:proofErr w:type="spellStart"/>
+      <w:r>
+        <w:rPr>
+          <w:rFonts w:ascii="Segoe UI Emoji" w:hAnsi="Segoe UI Emoji" w:cs="Segoe UI Emoji"/>
+        </w:rPr>
+        <w:t>npx</w:t>
+      </w:r>
+      <w:proofErr w:type="spellEnd"/>
+      <w:r>
+        <w:rPr>
+          <w:rFonts w:ascii="Segoe UI Emoji" w:hAnsi="Segoe UI Emoji" w:cs="Segoe UI Emoji"/>
+        </w:rPr>
+        <w:t xml:space="preserve"> </w:t>
+      </w:r>
+      <w:proofErr w:type="spellStart"/>
+      <w:r>
+        <w:rPr>
+          <w:rFonts w:ascii="Segoe UI Emoji" w:hAnsi="Segoe UI Emoji" w:cs="Segoe UI Emoji"/>
+        </w:rPr>
+        <w:t>prisma</w:t>
+      </w:r>
+      <w:proofErr w:type="spellEnd"/>
+      <w:r>
+        <w:rPr>
+          <w:rFonts w:ascii="Segoe UI Emoji" w:hAnsi="Segoe UI Emoji" w:cs="Segoe UI Emoji"/>
+        </w:rPr>
+        <w:t xml:space="preserve"> generate</w:t>
+      </w:r>
+    </w:p>
+    <w:p>
+      <w:pPr>
+        <w:ind w:left="720"/>
+        <w:rPr>
+          <w:rFonts w:ascii="Segoe UI Emoji" w:hAnsi="Segoe UI Emoji" w:cs="Segoe UI Emoji"/>
+        </w:rPr>
+      </w:pPr>
+      <w:proofErr w:type="spellStart"/>
+      <w:r>
+        <w:rPr>
+          <w:rFonts w:ascii="Segoe UI Emoji" w:hAnsi="Segoe UI Emoji" w:cs="Segoe UI Emoji"/>
+        </w:rPr>
+        <w:t>npx</w:t>
+      </w:r>
+      <w:proofErr w:type="spellEnd"/>
+      <w:r>
+        <w:rPr>
+          <w:rFonts w:ascii="Segoe UI Emoji" w:hAnsi="Segoe UI Emoji" w:cs="Segoe UI Emoji"/>
+        </w:rPr>
+        <w:t xml:space="preserve"> </w:t>
+      </w:r>
+      <w:proofErr w:type="spellStart"/>
+      <w:r>
+        <w:rPr>
+          <w:rFonts w:ascii="Segoe UI Emoji" w:hAnsi="Segoe UI Emoji" w:cs="Segoe UI Emoji"/>
+        </w:rPr>
+        <w:t>prisma</w:t>
+      </w:r>
+      <w:proofErr w:type="spellEnd"/>
+      <w:r>
+        <w:rPr>
+          <w:rFonts w:ascii="Segoe UI Emoji" w:hAnsi="Segoe UI Emoji" w:cs="Segoe UI Emoji"/>
+        </w:rPr>
+        <w:t xml:space="preserve"> migrate dev</w:t>
+      </w:r>
+    </w:p>
+    <w:p>
+      <w:pPr>
+        <w:ind w:left="720"/>
+        <w:rPr>
+          <w:rFonts w:ascii="Segoe UI Emoji" w:hAnsi="Segoe UI Emoji" w:cs="Segoe UI Emoji"/>
+        </w:rPr>
+      </w:pPr>
+    </w:p>
+    <w:p>
+      <w:pPr>
+        <w:ind w:left="720"/>
+        <w:rPr>
+          <w:rFonts w:ascii="Segoe UI Emoji" w:hAnsi="Segoe UI Emoji" w:cs="Segoe UI Emoji"/>
+        </w:rPr>
+      </w:pPr>
+      <w:r>
+        <w:rPr>
+          <w:rFonts w:ascii="Segoe UI Emoji" w:hAnsi="Segoe UI Emoji" w:cs="Segoe UI Emoji"/>
+        </w:rPr>
+        <w:t xml:space="preserve"># 4. </w:t>
+      </w:r>
+      <w:proofErr w:type="spellStart"/>
+      <w:r>
+        <w:rPr>
+          <w:rFonts w:ascii="Segoe UI Emoji" w:hAnsi="Segoe UI Emoji" w:cs="Segoe UI Emoji"/>
+        </w:rPr>
+        <w:t>Jalanin</w:t>
+      </w:r>
+      <w:proofErr w:type="spellEnd"/>
+    </w:p>
+    <w:p>
+      <w:pPr>
+        <w:ind w:left="720"/>
+        <w:rPr>
+          <w:rFonts w:ascii="Segoe UI Emoji" w:hAnsi="Segoe UI Emoji" w:cs="Segoe UI Emoji"/>
+        </w:rPr>
+      </w:pPr>
+      <w:proofErr w:type="spellStart"/>
+      <w:r>
+        <w:rPr>
+          <w:rFonts w:ascii="Segoe UI Emoji" w:hAnsi="Segoe UI Emoji" w:cs="Segoe UI Emoji"/>
+        </w:rPr>
+        <w:t>npm</w:t>
+      </w:r>
+      <w:proofErr w:type="spellEnd"/>
+      <w:r>
+        <w:rPr>
+          <w:rFonts w:ascii="Segoe UI Emoji" w:hAnsi="Segoe UI Emoji" w:cs="Segoe UI Emoji"/>
+        </w:rPr>
+        <w:t xml:space="preserve"> run </w:t>
+      </w:r>
+      <w:proofErr w:type="spellStart"/>
+      <w:proofErr w:type="gramStart"/>
+      <w:r>
+        <w:rPr>
+          <w:rFonts w:ascii="Segoe UI Emoji" w:hAnsi="Segoe UI Emoji" w:cs="Segoe UI Emoji"/>
+        </w:rPr>
+        <w:t>start:dev</w:t>
+      </w:r>
+      <w:proofErr w:type="spellEnd"/>
+      <w:proofErr w:type="gramEnd"/>
+    </w:p>
+    <w:p>
+      <w:pPr>
+        <w:rPr>
+          <w:rFonts w:ascii="Segoe UI Emoji" w:hAnsi="Segoe UI Emoji" w:cs="Segoe UI Emoji"/>
+          <w:b/>
+          <w:bCs/>
+        </w:rPr>
+      </w:pPr>
+    </w:p>
+    <w:p>
+      <w:pPr>
+        <w:rPr>
+          <w:rFonts w:ascii="Segoe UI Emoji" w:hAnsi="Segoe UI Emoji" w:cs="Segoe UI Emoji"/>
           <w:b/>
           <w:bCs/>
         </w:rPr>
@@ -404,6 +683,7 @@
           <w:b/>
           <w:bCs/>
         </w:rPr>
+        <w:lastRenderedPageBreak/>
         <w:t>Initialize Prisma:</w:t>
       </w:r>
       <w:r>
@@ -766,14 +1046,6 @@
           <w:bCs/>
         </w:rPr>
         <w:br/>
-      </w:r>
-      <w:r>
-        <w:rPr>
-          <w:rFonts w:ascii="Segoe UI Emoji" w:hAnsi="Segoe UI Emoji" w:cs="Segoe UI Emoji"/>
-          <w:b/>
-          <w:bCs/>
-        </w:rPr>
-        <w:lastRenderedPageBreak/>
         <w:t>username String @unique @</w:t>
       </w:r>
       <w:proofErr w:type="gramStart"/>
@@ -1402,6 +1674,7 @@
           <w:b/>
           <w:bCs/>
         </w:rPr>
+        <w:lastRenderedPageBreak/>
         <w:t>Generate</w:t>
       </w:r>
       <w:r>
@@ -1795,7 +2068,6 @@
           <w:b/>
           <w:bCs/>
         </w:rPr>
-        <w:lastRenderedPageBreak/>
         <w:t>Add Admin module to generate/assign VRP routes</w:t>
       </w:r>
     </w:p>
@@ -3668,6 +3940,7 @@
   <w:style w:type="character" w:default="1" w:styleId="DefaultParagraphFont">
     <w:name w:val="Default Paragraph Font"/>
     <w:uiPriority w:val="1"/>
+    <w:semiHidden/>
     <w:unhideWhenUsed/>
   </w:style>
   <w:style w:type="table" w:default="1" w:styleId="TableNormal">
@@ -4344,6 +4617,21 @@
 </file>
 
 <file path=customXml/item1.xml><?xml version="1.0" encoding="utf-8"?>
+<p:properties xmlns:p="http://schemas.microsoft.com/office/2006/metadata/properties" xmlns:xsi="http://www.w3.org/2001/XMLSchema-instance" xmlns:pc="http://schemas.microsoft.com/office/infopath/2007/PartnerControls">
+  <documentManagement/>
+</p:properties>
+</file>
+
+<file path=customXml/item2.xml><?xml version="1.0" encoding="utf-8"?>
+<?mso-contentType ?>
+<FormTemplates xmlns="http://schemas.microsoft.com/sharepoint/v3/contenttype/forms">
+  <Display>DocumentLibraryForm</Display>
+  <Edit>DocumentLibraryForm</Edit>
+  <New>DocumentLibraryForm</New>
+</FormTemplates>
+</file>
+
+<file path=customXml/item3.xml><?xml version="1.0" encoding="utf-8"?>
 <ct:contentTypeSchema xmlns:ct="http://schemas.microsoft.com/office/2006/metadata/contentType" xmlns:ma="http://schemas.microsoft.com/office/2006/metadata/properties/metaAttributes" ct:_="" ma:_="" ma:contentTypeName="Document" ma:contentTypeID="0x010100406736E78DE74B46A2ACD7A5E46E43B9" ma:contentTypeVersion="4" ma:contentTypeDescription="Create a new document." ma:contentTypeScope="" ma:versionID="d17869f040531773f7e0701c8f6a3f7c">
   <xsd:schema xmlns:xsd="http://www.w3.org/2001/XMLSchema" xmlns:xs="http://www.w3.org/2001/XMLSchema" xmlns:p="http://schemas.microsoft.com/office/2006/metadata/properties" xmlns:ns3="9a0c3051-f62f-4680-8629-b0845361cf5f" targetNamespace="http://schemas.microsoft.com/office/2006/metadata/properties" ma:root="true" ma:fieldsID="37ff04cc8968e939b472745d1ca215f8" ns3:_="">
     <xsd:import namespace="9a0c3051-f62f-4680-8629-b0845361cf5f"/>
@@ -4487,22 +4775,24 @@
 </ct:contentTypeSchema>
 </file>
 
-<file path=customXml/item2.xml><?xml version="1.0" encoding="utf-8"?>
-<?mso-contentType ?>
-<FormTemplates xmlns="http://schemas.microsoft.com/sharepoint/v3/contenttype/forms">
-  <Display>DocumentLibraryForm</Display>
-  <Edit>DocumentLibraryForm</Edit>
-  <New>DocumentLibraryForm</New>
-</FormTemplates>
+<file path=customXml/itemProps1.xml><?xml version="1.0" encoding="utf-8"?>
+<ds:datastoreItem xmlns:ds="http://schemas.openxmlformats.org/officeDocument/2006/customXml" ds:itemID="{E4AAB88E-B1CC-494D-ABE8-5DE576A51383}">
+  <ds:schemaRefs>
+    <ds:schemaRef ds:uri="http://schemas.microsoft.com/office/2006/metadata/properties"/>
+    <ds:schemaRef ds:uri="http://schemas.microsoft.com/office/infopath/2007/PartnerControls"/>
+  </ds:schemaRefs>
+</ds:datastoreItem>
 </file>
 
-<file path=customXml/item3.xml><?xml version="1.0" encoding="utf-8"?>
-<p:properties xmlns:p="http://schemas.microsoft.com/office/2006/metadata/properties" xmlns:xsi="http://www.w3.org/2001/XMLSchema-instance" xmlns:pc="http://schemas.microsoft.com/office/infopath/2007/PartnerControls">
-  <documentManagement/>
-</p:properties>
+<file path=customXml/itemProps2.xml><?xml version="1.0" encoding="utf-8"?>
+<ds:datastoreItem xmlns:ds="http://schemas.openxmlformats.org/officeDocument/2006/customXml" ds:itemID="{275805C0-3F9E-402A-BBEF-B85670B49646}">
+  <ds:schemaRefs>
+    <ds:schemaRef ds:uri="http://schemas.microsoft.com/sharepoint/v3/contenttype/forms"/>
+  </ds:schemaRefs>
+</ds:datastoreItem>
 </file>
 
-<file path=customXml/itemProps1.xml><?xml version="1.0" encoding="utf-8"?>
+<file path=customXml/itemProps3.xml><?xml version="1.0" encoding="utf-8"?>
 <ds:datastoreItem xmlns:ds="http://schemas.openxmlformats.org/officeDocument/2006/customXml" ds:itemID="{A30BA85E-19C3-412D-B4BC-80A2867BC995}">
   <ds:schemaRefs>
     <ds:schemaRef ds:uri="http://schemas.microsoft.com/office/2006/metadata/contentType"/>
@@ -4518,21 +4808,4 @@
     <ds:schemaRef ds:uri="http://schemas.microsoft.com/internal/obd"/>
   </ds:schemaRefs>
 </ds:datastoreItem>
-</file>
-
-<file path=customXml/itemProps2.xml><?xml version="1.0" encoding="utf-8"?>
-<ds:datastoreItem xmlns:ds="http://schemas.openxmlformats.org/officeDocument/2006/customXml" ds:itemID="{275805C0-3F9E-402A-BBEF-B85670B49646}">
-  <ds:schemaRefs>
-    <ds:schemaRef ds:uri="http://schemas.microsoft.com/sharepoint/v3/contenttype/forms"/>
-  </ds:schemaRefs>
-</ds:datastoreItem>
-</file>
-
-<file path=customXml/itemProps3.xml><?xml version="1.0" encoding="utf-8"?>
-<ds:datastoreItem xmlns:ds="http://schemas.openxmlformats.org/officeDocument/2006/customXml" ds:itemID="{E4AAB88E-B1CC-494D-ABE8-5DE576A51383}">
-  <ds:schemaRefs>
-    <ds:schemaRef ds:uri="http://schemas.microsoft.com/office/2006/metadata/properties"/>
-    <ds:schemaRef ds:uri="http://schemas.microsoft.com/office/infopath/2007/PartnerControls"/>
-  </ds:schemaRefs>
-</ds:datastoreItem>
 </file>
</xml_diff>